<commit_message>
add data EDA and revise introduction
</commit_message>
<xml_diff>
--- a/Report/Introduction.docx
+++ b/Report/Introduction.docx
@@ -174,137 +174,511 @@
       </w:r>
     </w:p>
     <w:p>
-      <w:r>
-        <w:t xml:space="preserve">However, </w:t>
-      </w:r>
-      <w:r>
-        <w:t>b</w:t>
-      </w:r>
-      <w:r>
-        <w:t xml:space="preserve">iomedical data can provide significant challenges. The language in research papers </w:t>
-      </w:r>
-      <w:r>
-        <w:t xml:space="preserve">often </w:t>
-      </w:r>
-      <w:r>
-        <w:t xml:space="preserve">contains complex terminology, domain-specific phrases and abbreviations which can be difficult for models to interpret. </w:t>
-      </w:r>
-      <w:r>
-        <w:t xml:space="preserve">Additionally, abstracts are usually dense and </w:t>
-      </w:r>
-      <w:r>
-        <w:t>information-rich,</w:t>
-      </w:r>
-      <w:r>
-        <w:t xml:space="preserve"> requiring models to identify</w:t>
-      </w:r>
-      <w:r>
-        <w:t xml:space="preserve"> and extract</w:t>
-      </w:r>
-      <w:r>
-        <w:t xml:space="preserve"> relevant details from </w:t>
-      </w:r>
-      <w:r>
-        <w:t>long passages of</w:t>
-      </w:r>
-      <w:r>
-        <w:t xml:space="preserve"> text.</w:t>
-      </w:r>
-      <w:r>
-        <w:t xml:space="preserve"> Many questions also require inferential reasoning rather than simple keyword matching, further increasing difficulty.</w:t>
-      </w:r>
-      <w:r>
-        <w:t xml:space="preserve"> </w:t>
-      </w:r>
-      <w:r>
-        <w:t xml:space="preserve">These challenges </w:t>
-      </w:r>
-      <w:r>
-        <w:t xml:space="preserve">highlight the importance of selecting appropriate text representations and architecture in order to achieve high accuracy and reliability. </w:t>
+      <w:pPr>
+        <w:rPr>
+          <w:lang w:eastAsia="zh-CN"/>
+        </w:rPr>
+      </w:pPr>
+      <w:r>
+        <w:rPr>
+          <w:noProof/>
+        </w:rPr>
+        <w:drawing>
+          <wp:inline distT="0" distB="0" distL="0" distR="0" wp14:anchorId="4954D66D" wp14:editId="22FC7E49">
+            <wp:extent cx="3758026" cy="2505351"/>
+            <wp:effectExtent l="0" t="0" r="0" b="9525"/>
+            <wp:docPr id="758680646" name="图片 2"/>
+            <wp:cNvGraphicFramePr>
+              <a:graphicFrameLocks xmlns:a="http://schemas.openxmlformats.org/drawingml/2006/main" noChangeAspect="1"/>
+            </wp:cNvGraphicFramePr>
+            <a:graphic xmlns:a="http://schemas.openxmlformats.org/drawingml/2006/main">
+              <a:graphicData uri="http://schemas.openxmlformats.org/drawingml/2006/picture">
+                <pic:pic xmlns:pic="http://schemas.openxmlformats.org/drawingml/2006/picture">
+                  <pic:nvPicPr>
+                    <pic:cNvPr id="758680646" name="图片 758680646"/>
+                    <pic:cNvPicPr/>
+                  </pic:nvPicPr>
+                  <pic:blipFill>
+                    <a:blip r:embed="rId5" cstate="print">
+                      <a:extLst>
+                        <a:ext uri="{28A0092B-C50C-407E-A947-70E740481C1C}">
+                          <a14:useLocalDpi xmlns:a14="http://schemas.microsoft.com/office/drawing/2010/main" val="0"/>
+                        </a:ext>
+                      </a:extLst>
+                    </a:blip>
+                    <a:stretch>
+                      <a:fillRect/>
+                    </a:stretch>
+                  </pic:blipFill>
+                  <pic:spPr>
+                    <a:xfrm>
+                      <a:off x="0" y="0"/>
+                      <a:ext cx="3775707" cy="2517138"/>
+                    </a:xfrm>
+                    <a:prstGeom prst="rect">
+                      <a:avLst/>
+                    </a:prstGeom>
+                  </pic:spPr>
+                </pic:pic>
+              </a:graphicData>
+            </a:graphic>
+          </wp:inline>
+        </w:drawing>
       </w:r>
     </w:p>
     <w:p>
-      <w:r>
+      <w:pPr>
+        <w:rPr>
+          <w:lang w:eastAsia="zh-CN"/>
+        </w:rPr>
+      </w:pPr>
+      <w:r>
+        <w:rPr>
+          <w:rFonts w:hint="eastAsia"/>
+          <w:lang w:eastAsia="zh-CN"/>
+        </w:rPr>
+        <w:t>Fig.1 Label Distribution in PQA-L</w:t>
+      </w:r>
+    </w:p>
+    <w:p>
+      <w:pPr>
+        <w:rPr>
+          <w:lang w:eastAsia="zh-CN"/>
+        </w:rPr>
+      </w:pPr>
+      <w:r>
+        <w:rPr>
+          <w:rFonts w:hint="eastAsia"/>
+          <w:noProof/>
+          <w:lang w:eastAsia="zh-CN"/>
+        </w:rPr>
+        <w:lastRenderedPageBreak/>
+        <w:drawing>
+          <wp:inline distT="0" distB="0" distL="0" distR="0" wp14:anchorId="1BA94672" wp14:editId="00C369DC">
+            <wp:extent cx="3781811" cy="2521207"/>
+            <wp:effectExtent l="0" t="0" r="9525" b="0"/>
+            <wp:docPr id="843381442" name="图片 3"/>
+            <wp:cNvGraphicFramePr>
+              <a:graphicFrameLocks xmlns:a="http://schemas.openxmlformats.org/drawingml/2006/main" noChangeAspect="1"/>
+            </wp:cNvGraphicFramePr>
+            <a:graphic xmlns:a="http://schemas.openxmlformats.org/drawingml/2006/main">
+              <a:graphicData uri="http://schemas.openxmlformats.org/drawingml/2006/picture">
+                <pic:pic xmlns:pic="http://schemas.openxmlformats.org/drawingml/2006/picture">
+                  <pic:nvPicPr>
+                    <pic:cNvPr id="843381442" name="图片 843381442"/>
+                    <pic:cNvPicPr/>
+                  </pic:nvPicPr>
+                  <pic:blipFill>
+                    <a:blip r:embed="rId6" cstate="print">
+                      <a:extLst>
+                        <a:ext uri="{28A0092B-C50C-407E-A947-70E740481C1C}">
+                          <a14:useLocalDpi xmlns:a14="http://schemas.microsoft.com/office/drawing/2010/main" val="0"/>
+                        </a:ext>
+                      </a:extLst>
+                    </a:blip>
+                    <a:stretch>
+                      <a:fillRect/>
+                    </a:stretch>
+                  </pic:blipFill>
+                  <pic:spPr>
+                    <a:xfrm>
+                      <a:off x="0" y="0"/>
+                      <a:ext cx="3808463" cy="2538975"/>
+                    </a:xfrm>
+                    <a:prstGeom prst="rect">
+                      <a:avLst/>
+                    </a:prstGeom>
+                  </pic:spPr>
+                </pic:pic>
+              </a:graphicData>
+            </a:graphic>
+          </wp:inline>
+        </w:drawing>
+      </w:r>
+    </w:p>
+    <w:p>
+      <w:pPr>
+        <w:rPr>
+          <w:lang w:eastAsia="zh-CN"/>
+        </w:rPr>
+      </w:pPr>
+      <w:r>
+        <w:rPr>
+          <w:rFonts w:hint="eastAsia"/>
+          <w:lang w:eastAsia="zh-CN"/>
+        </w:rPr>
+        <w:t>Fig.2 Context Length Distribution in PQA-L</w:t>
+      </w:r>
+    </w:p>
+    <w:p>
+      <w:pPr>
+        <w:rPr>
+          <w:color w:val="EE0000"/>
+        </w:rPr>
+      </w:pPr>
+      <w:r>
+        <w:rPr>
+          <w:rFonts w:hint="eastAsia"/>
+          <w:color w:val="EE0000"/>
+          <w:lang w:eastAsia="zh-CN"/>
+        </w:rPr>
+        <w:t xml:space="preserve">As shown in Fig.1, the dataset shows label imbalance, yes accounts for 55.2%, no for 33.8%, and maybe </w:t>
+      </w:r>
+      <w:r>
+        <w:rPr>
+          <w:rFonts w:hint="eastAsia"/>
+          <w:color w:val="EE0000"/>
+          <w:lang w:eastAsia="zh-CN"/>
+        </w:rPr>
+        <w:t>for only</w:t>
+      </w:r>
+      <w:r>
+        <w:rPr>
+          <w:rFonts w:hint="eastAsia"/>
+          <w:color w:val="EE0000"/>
+          <w:lang w:eastAsia="zh-CN"/>
+        </w:rPr>
+        <w:t xml:space="preserve"> 11.0%. This distribution means that </w:t>
+      </w:r>
+      <w:r>
+        <w:rPr>
+          <w:color w:val="EE0000"/>
+          <w:lang w:eastAsia="zh-CN"/>
+        </w:rPr>
+        <w:t>accuracy</w:t>
+      </w:r>
+      <w:r>
+        <w:rPr>
+          <w:rFonts w:hint="eastAsia"/>
+          <w:color w:val="EE0000"/>
+          <w:lang w:eastAsia="zh-CN"/>
+        </w:rPr>
+        <w:t xml:space="preserve"> alone is an insufficient evaluation matric, and using macro-averaged F1 is needed. Besides, in Fig.2, contexts average 200 words in length, with some </w:t>
+      </w:r>
+      <w:r>
+        <w:rPr>
+          <w:rFonts w:hint="eastAsia"/>
+          <w:color w:val="EE0000"/>
+          <w:lang w:eastAsia="zh-CN"/>
+        </w:rPr>
+        <w:t>exceeding</w:t>
+      </w:r>
+      <w:r>
+        <w:rPr>
+          <w:rFonts w:hint="eastAsia"/>
+          <w:color w:val="EE0000"/>
+          <w:lang w:eastAsia="zh-CN"/>
+        </w:rPr>
+        <w:t xml:space="preserve"> 400 words, indicating the challenge of extracting relevant information from dense biomedical contexts.</w:t>
+      </w:r>
+    </w:p>
+    <w:p>
+      <w:r>
+        <w:t xml:space="preserve">However, </w:t>
+      </w:r>
+      <w:r>
+        <w:t>b</w:t>
+      </w:r>
+      <w:r>
+        <w:t xml:space="preserve">iomedical data can provide significant challenges. The language in research papers </w:t>
+      </w:r>
+      <w:r>
+        <w:t xml:space="preserve">often </w:t>
+      </w:r>
+      <w:r>
+        <w:t xml:space="preserve">contains complex terminology, domain-specific phrases and abbreviations which can be difficult for models to interpret. </w:t>
+      </w:r>
+      <w:r>
+        <w:t xml:space="preserve">Additionally, abstracts are usually dense and </w:t>
+      </w:r>
+      <w:r>
+        <w:t>information-rich,</w:t>
+      </w:r>
+      <w:r>
+        <w:t xml:space="preserve"> requiring models to identify</w:t>
+      </w:r>
+      <w:r>
+        <w:t xml:space="preserve"> and extract</w:t>
+      </w:r>
+      <w:r>
+        <w:t xml:space="preserve"> relevant details from </w:t>
+      </w:r>
+      <w:r>
+        <w:t>long passages of</w:t>
+      </w:r>
+      <w:r>
+        <w:t xml:space="preserve"> text.</w:t>
+      </w:r>
+      <w:r>
+        <w:t xml:space="preserve"> Many questions also require inferential reasoning rather than simple keyword matching, further increasing difficulty.</w:t>
+      </w:r>
+      <w:r>
+        <w:t xml:space="preserve"> </w:t>
+      </w:r>
+      <w:r>
+        <w:t xml:space="preserve">These challenges </w:t>
+      </w:r>
+      <w:r>
+        <w:t xml:space="preserve">highlight the importance of selecting appropriate text representations and architecture in order to achieve high accuracy and reliability. </w:t>
+      </w:r>
+    </w:p>
+    <w:p>
+      <w:pPr>
+        <w:rPr>
+          <w:color w:val="EE0000"/>
+          <w:lang w:eastAsia="zh-CN"/>
+        </w:rPr>
+      </w:pPr>
+      <w:r>
+        <w:rPr>
+          <w:rFonts w:hint="eastAsia"/>
+          <w:color w:val="EE0000"/>
+          <w:lang w:eastAsia="zh-CN"/>
+        </w:rPr>
+        <w:t>To address these challenges, we structure our experiment around two key axes. The first axis is text representation: we evaluate how different encoding strategies, from sparse statistical features to dense contextual embeddings</w:t>
+      </w:r>
+      <w:r>
+        <w:rPr>
+          <w:rFonts w:hint="eastAsia"/>
+          <w:color w:val="EE0000"/>
+          <w:lang w:eastAsia="zh-CN"/>
+        </w:rPr>
+        <w:t>, affect model performance</w:t>
+      </w:r>
+      <w:r>
+        <w:rPr>
+          <w:rFonts w:hint="eastAsia"/>
+          <w:color w:val="EE0000"/>
+          <w:lang w:eastAsia="zh-CN"/>
+        </w:rPr>
+        <w:t>. The second is</w:t>
+      </w:r>
+      <w:r>
+        <w:rPr>
+          <w:rFonts w:hint="eastAsia"/>
+          <w:color w:val="EE0000"/>
+          <w:lang w:eastAsia="zh-CN"/>
+        </w:rPr>
+        <w:t xml:space="preserve"> the answer</w:t>
+      </w:r>
+      <w:r>
+        <w:rPr>
+          <w:rFonts w:hint="eastAsia"/>
+          <w:color w:val="EE0000"/>
+          <w:lang w:eastAsia="zh-CN"/>
+        </w:rPr>
+        <w:t xml:space="preserve"> generation axis, </w:t>
+      </w:r>
+      <w:r>
+        <w:rPr>
+          <w:color w:val="EE0000"/>
+          <w:lang w:eastAsia="zh-CN"/>
+        </w:rPr>
+        <w:t xml:space="preserve">where we compare different ways of predicting the final answer, from traditional classifiers to large language generative models. </w:t>
+      </w:r>
+      <w:r>
+        <w:rPr>
+          <w:rFonts w:hint="eastAsia"/>
+          <w:color w:val="EE0000"/>
+          <w:lang w:eastAsia="zh-CN"/>
+        </w:rPr>
+        <w:t>Combin</w:t>
+      </w:r>
+      <w:r>
+        <w:rPr>
+          <w:rFonts w:hint="eastAsia"/>
+          <w:color w:val="EE0000"/>
+          <w:lang w:eastAsia="zh-CN"/>
+        </w:rPr>
+        <w:t>ing</w:t>
+      </w:r>
+      <w:r>
+        <w:rPr>
+          <w:rFonts w:hint="eastAsia"/>
+          <w:color w:val="EE0000"/>
+          <w:lang w:eastAsia="zh-CN"/>
+        </w:rPr>
+        <w:t xml:space="preserve"> these two axes, we systematically vary key components within a shared pipeline to understand their impact on performance.</w:t>
+      </w:r>
+    </w:p>
+    <w:p>
+      <w:pPr>
+        <w:rPr>
+          <w:strike/>
+        </w:rPr>
+      </w:pPr>
+      <w:r>
+        <w:rPr>
+          <w:strike/>
+        </w:rPr>
         <w:t xml:space="preserve">A key </w:t>
       </w:r>
       <w:r>
+        <w:rPr>
+          <w:strike/>
+        </w:rPr>
         <w:t>factor influencing</w:t>
       </w:r>
       <w:r>
+        <w:rPr>
+          <w:strike/>
+        </w:rPr>
         <w:t xml:space="preserve"> QAS performance is text representation. </w:t>
       </w:r>
       <w:r>
+        <w:rPr>
+          <w:strike/>
+        </w:rPr>
         <w:t>Traditional</w:t>
       </w:r>
       <w:r>
+        <w:rPr>
+          <w:strike/>
+        </w:rPr>
         <w:t xml:space="preserve"> bag-of-words and TF-IDF representations are </w:t>
       </w:r>
       <w:r>
+        <w:rPr>
+          <w:strike/>
+        </w:rPr>
         <w:t>simple and easy to</w:t>
       </w:r>
       <w:r>
+        <w:rPr>
+          <w:strike/>
+        </w:rPr>
         <w:t xml:space="preserve"> interpret but often fail to capture </w:t>
       </w:r>
       <w:r>
+        <w:rPr>
+          <w:strike/>
+        </w:rPr>
         <w:t>semantic relationships and contextual meaning</w:t>
       </w:r>
       <w:r>
+        <w:rPr>
+          <w:strike/>
+        </w:rPr>
         <w:t xml:space="preserve">. </w:t>
       </w:r>
       <w:r>
+        <w:rPr>
+          <w:strike/>
+        </w:rPr>
         <w:t>In contrast, m</w:t>
       </w:r>
       <w:r>
+        <w:rPr>
+          <w:strike/>
+        </w:rPr>
         <w:t>ore advanced embedding</w:t>
       </w:r>
       <w:r>
+        <w:rPr>
+          <w:strike/>
+        </w:rPr>
         <w:t>-based-methods can represent text in a way that better captures meaning and context which is particularly important in specialised domains</w:t>
       </w:r>
       <w:r>
+        <w:rPr>
+          <w:strike/>
+        </w:rPr>
         <w:t xml:space="preserve">. </w:t>
       </w:r>
       <w:r>
+        <w:rPr>
+          <w:strike/>
+        </w:rPr>
         <w:t xml:space="preserve">A further key </w:t>
       </w:r>
       <w:r>
+        <w:rPr>
+          <w:strike/>
+        </w:rPr>
         <w:t>design consideration is model selection</w:t>
       </w:r>
       <w:r>
+        <w:rPr>
+          <w:strike/>
+        </w:rPr>
         <w:t>.</w:t>
       </w:r>
       <w:r>
+        <w:rPr>
+          <w:strike/>
+        </w:rPr>
         <w:t xml:space="preserve"> Classification </w:t>
       </w:r>
       <w:r>
+        <w:rPr>
+          <w:strike/>
+        </w:rPr>
         <w:t>approaches</w:t>
       </w:r>
       <w:r>
+        <w:rPr>
+          <w:strike/>
+        </w:rPr>
         <w:t xml:space="preserve"> are</w:t>
       </w:r>
       <w:r>
+        <w:rPr>
+          <w:strike/>
+        </w:rPr>
         <w:t xml:space="preserve"> typically</w:t>
       </w:r>
       <w:r>
+        <w:rPr>
+          <w:strike/>
+        </w:rPr>
         <w:t xml:space="preserve"> more </w:t>
       </w:r>
       <w:r>
+        <w:rPr>
+          <w:strike/>
+        </w:rPr>
         <w:lastRenderedPageBreak/>
         <w:t>efficient,</w:t>
       </w:r>
       <w:r>
+        <w:rPr>
+          <w:strike/>
+        </w:rPr>
         <w:t xml:space="preserve"> and performance is easier to evaluate</w:t>
       </w:r>
       <w:r>
+        <w:rPr>
+          <w:strike/>
+        </w:rPr>
         <w:t>, especially when answers are limited to predetermined labels. However, they may struggle to capture nuance. In comparison, generative models are more flexible and can produce stronger answer but provide additional challenges such as increased complexity and potential for error.</w:t>
       </w:r>
       <w:r>
-        <w:t xml:space="preserve"> </w:t>
-      </w:r>
-      <w:r>
-        <w:t>Understanding how text presentation and model architecture interact to affect answer quality is key to optimising performance.</w:t>
+        <w:rPr>
+          <w:strike/>
+        </w:rPr>
+        <w:t xml:space="preserve"> Understanding how text </w:t>
+      </w:r>
+      <w:r>
+        <w:rPr>
+          <w:rFonts w:hint="eastAsia"/>
+          <w:strike/>
+          <w:lang w:eastAsia="zh-CN"/>
+        </w:rPr>
+        <w:t>re</w:t>
+      </w:r>
+      <w:r>
+        <w:rPr>
+          <w:strike/>
+        </w:rPr>
+        <w:t>presentation and model architecture interact to affect answer quality is key to optimising performance.</w:t>
       </w:r>
     </w:p>
     <w:p>
+      <w:pPr>
+        <w:rPr>
+          <w:lang w:eastAsia="zh-CN"/>
+        </w:rPr>
+      </w:pPr>
       <w:r>
         <w:t xml:space="preserve">A good solution will be able to accurately interpret both the question and context, understand domain-specific semantics, and </w:t>
       </w:r>
@@ -315,13 +689,305 @@
         <w:t xml:space="preserve"> that are reliable and consistent.</w:t>
       </w:r>
       <w:r>
-        <w:t xml:space="preserve"> This project evaluates how different text representations and machine learning methods influence the performance of a biomedical QAS by assessing answer quality. </w:t>
+        <w:t xml:space="preserve"> </w:t>
+      </w:r>
+      <w:r>
+        <w:rPr>
+          <w:rFonts w:hint="eastAsia"/>
+          <w:color w:val="EE0000"/>
+          <w:lang w:eastAsia="zh-CN"/>
+        </w:rPr>
+        <w:t xml:space="preserve">First, </w:t>
+      </w:r>
+      <w:r>
+        <w:rPr>
+          <w:rFonts w:hint="eastAsia"/>
+          <w:color w:val="EE0000"/>
+          <w:lang w:eastAsia="zh-CN"/>
+        </w:rPr>
+        <w:t xml:space="preserve">it must handle the problem of </w:t>
+      </w:r>
+      <w:r>
+        <w:rPr>
+          <w:rFonts w:hint="eastAsia"/>
+          <w:color w:val="EE0000"/>
+          <w:lang w:eastAsia="zh-CN"/>
+        </w:rPr>
+        <w:t>class</w:t>
+      </w:r>
+      <w:r>
+        <w:rPr>
+          <w:rFonts w:hint="eastAsia"/>
+          <w:color w:val="EE0000"/>
+          <w:lang w:eastAsia="zh-CN"/>
+        </w:rPr>
+        <w:t xml:space="preserve"> </w:t>
+      </w:r>
+      <w:r>
+        <w:rPr>
+          <w:rFonts w:hint="eastAsia"/>
+          <w:color w:val="EE0000"/>
+          <w:lang w:eastAsia="zh-CN"/>
+        </w:rPr>
+        <w:t>im</w:t>
+      </w:r>
+      <w:r>
+        <w:rPr>
+          <w:rFonts w:hint="eastAsia"/>
+          <w:color w:val="EE0000"/>
+          <w:lang w:eastAsia="zh-CN"/>
+        </w:rPr>
+        <w:t>balance. The dataset</w:t>
+      </w:r>
+      <w:r>
+        <w:rPr>
+          <w:color w:val="EE0000"/>
+          <w:lang w:eastAsia="zh-CN"/>
+        </w:rPr>
+        <w:t>’</w:t>
+      </w:r>
+      <w:r>
+        <w:rPr>
+          <w:rFonts w:hint="eastAsia"/>
+          <w:color w:val="EE0000"/>
+          <w:lang w:eastAsia="zh-CN"/>
+        </w:rPr>
+        <w:t xml:space="preserve">s label distribution is heavily </w:t>
+      </w:r>
+      <w:r>
+        <w:rPr>
+          <w:rFonts w:hint="eastAsia"/>
+          <w:color w:val="EE0000"/>
+          <w:lang w:eastAsia="zh-CN"/>
+        </w:rPr>
+        <w:t>im</w:t>
+      </w:r>
+      <w:r>
+        <w:rPr>
+          <w:rFonts w:hint="eastAsia"/>
+          <w:color w:val="EE0000"/>
+          <w:lang w:eastAsia="zh-CN"/>
+        </w:rPr>
+        <w:t>balanc</w:t>
+      </w:r>
+      <w:r>
+        <w:rPr>
+          <w:rFonts w:hint="eastAsia"/>
+          <w:color w:val="EE0000"/>
+          <w:lang w:eastAsia="zh-CN"/>
+        </w:rPr>
+        <w:t>e</w:t>
+      </w:r>
+      <w:r>
+        <w:rPr>
+          <w:rFonts w:hint="eastAsia"/>
+          <w:color w:val="EE0000"/>
+          <w:lang w:eastAsia="zh-CN"/>
+        </w:rPr>
+        <w:t xml:space="preserve"> among yes, no, and maybe</w:t>
+      </w:r>
+      <w:r>
+        <w:rPr>
+          <w:rFonts w:hint="eastAsia"/>
+          <w:color w:val="EE0000"/>
+          <w:lang w:eastAsia="zh-CN"/>
+        </w:rPr>
+        <w:t>, with</w:t>
+      </w:r>
+      <w:r>
+        <w:rPr>
+          <w:rFonts w:hint="eastAsia"/>
+          <w:color w:val="EE0000"/>
+          <w:lang w:eastAsia="zh-CN"/>
+        </w:rPr>
+        <w:t xml:space="preserve"> maybe appearing far less frequently than yes and no</w:t>
+      </w:r>
+      <w:r>
+        <w:rPr>
+          <w:rFonts w:hint="eastAsia"/>
+          <w:color w:val="EE0000"/>
+          <w:lang w:eastAsia="zh-CN"/>
+        </w:rPr>
+        <w:t>. This</w:t>
+      </w:r>
+      <w:r>
+        <w:rPr>
+          <w:rFonts w:hint="eastAsia"/>
+          <w:color w:val="EE0000"/>
+          <w:lang w:eastAsia="zh-CN"/>
+        </w:rPr>
+        <w:t xml:space="preserve"> means that even though a model achieves high accuracy, it may still fail systematically on the minority class. Thus,</w:t>
+      </w:r>
+      <w:r>
+        <w:rPr>
+          <w:rFonts w:hint="eastAsia"/>
+          <w:color w:val="EE0000"/>
+          <w:lang w:eastAsia="zh-CN"/>
+        </w:rPr>
+        <w:t xml:space="preserve"> </w:t>
+      </w:r>
+      <w:r>
+        <w:rPr>
+          <w:rFonts w:hint="eastAsia"/>
+          <w:color w:val="EE0000"/>
+          <w:lang w:eastAsia="zh-CN"/>
+        </w:rPr>
+        <w:t xml:space="preserve">macro-averaged F1 is a more </w:t>
+      </w:r>
+      <w:r>
+        <w:rPr>
+          <w:rFonts w:hint="eastAsia"/>
+          <w:color w:val="EE0000"/>
+          <w:lang w:eastAsia="zh-CN"/>
+        </w:rPr>
+        <w:t>meaningful</w:t>
+      </w:r>
+      <w:r>
+        <w:rPr>
+          <w:rFonts w:hint="eastAsia"/>
+          <w:color w:val="EE0000"/>
+          <w:lang w:eastAsia="zh-CN"/>
+        </w:rPr>
+        <w:t xml:space="preserve"> evaluation </w:t>
+      </w:r>
+      <w:r>
+        <w:rPr>
+          <w:rFonts w:hint="eastAsia"/>
+          <w:color w:val="EE0000"/>
+          <w:lang w:eastAsia="zh-CN"/>
+        </w:rPr>
+        <w:t>metric</w:t>
+      </w:r>
+      <w:r>
+        <w:rPr>
+          <w:rFonts w:hint="eastAsia"/>
+          <w:color w:val="EE0000"/>
+          <w:lang w:eastAsia="zh-CN"/>
+        </w:rPr>
+        <w:t xml:space="preserve"> </w:t>
+      </w:r>
+      <w:r>
+        <w:rPr>
+          <w:rFonts w:hint="eastAsia"/>
+          <w:color w:val="EE0000"/>
+          <w:lang w:eastAsia="zh-CN"/>
+        </w:rPr>
+        <w:t>than accuracy alone. Second, models must reason over long, information-dense contexts</w:t>
+      </w:r>
+      <w:r>
+        <w:rPr>
+          <w:rFonts w:hint="eastAsia"/>
+          <w:color w:val="EE0000"/>
+          <w:lang w:eastAsia="zh-CN"/>
+        </w:rPr>
+        <w:t>, which</w:t>
+      </w:r>
+      <w:r>
+        <w:rPr>
+          <w:rFonts w:hint="eastAsia"/>
+          <w:color w:val="EE0000"/>
+          <w:lang w:eastAsia="zh-CN"/>
+        </w:rPr>
+        <w:t xml:space="preserve"> is a particular challenge for sparse representations. Third, we focus </w:t>
+      </w:r>
+      <w:r>
+        <w:rPr>
+          <w:rFonts w:hint="eastAsia"/>
+          <w:color w:val="EE0000"/>
+          <w:lang w:eastAsia="zh-CN"/>
+        </w:rPr>
+        <w:t xml:space="preserve">not only </w:t>
+      </w:r>
+      <w:r>
+        <w:rPr>
+          <w:rFonts w:hint="eastAsia"/>
+          <w:color w:val="EE0000"/>
+          <w:lang w:eastAsia="zh-CN"/>
+        </w:rPr>
+        <w:t xml:space="preserve">on model performance, but also on computational costs, making the efficiency of each approach a relevant factor. Based on the </w:t>
+      </w:r>
+      <w:r>
+        <w:rPr>
+          <w:rFonts w:hint="eastAsia"/>
+          <w:color w:val="EE0000"/>
+          <w:lang w:eastAsia="zh-CN"/>
+        </w:rPr>
+        <w:t>research</w:t>
+      </w:r>
+      <w:r>
+        <w:rPr>
+          <w:rFonts w:hint="eastAsia"/>
+          <w:color w:val="EE0000"/>
+          <w:lang w:eastAsia="zh-CN"/>
+        </w:rPr>
+        <w:t xml:space="preserve"> reported by Jin et al. 2019</w:t>
+      </w:r>
+      <w:r>
+        <w:rPr>
+          <w:rFonts w:hint="eastAsia"/>
+          <w:color w:val="EE0000"/>
+          <w:lang w:eastAsia="zh-CN"/>
+        </w:rPr>
+        <w:t>, a majority-class baseline achieves 55.2% accuracy, while reasoning-requi</w:t>
+      </w:r>
+      <w:r>
+        <w:rPr>
+          <w:rFonts w:hint="eastAsia"/>
+          <w:color w:val="EE0000"/>
+          <w:lang w:eastAsia="zh-CN"/>
+        </w:rPr>
+        <w:t>r</w:t>
+      </w:r>
+      <w:r>
+        <w:rPr>
+          <w:rFonts w:hint="eastAsia"/>
+          <w:color w:val="EE0000"/>
+          <w:lang w:eastAsia="zh-CN"/>
+        </w:rPr>
+        <w:t xml:space="preserve">ed human performance achieves 78.0%, providing </w:t>
+      </w:r>
+      <w:r>
+        <w:rPr>
+          <w:rFonts w:hint="eastAsia"/>
+          <w:color w:val="EE0000"/>
+          <w:lang w:eastAsia="zh-CN"/>
+        </w:rPr>
+        <w:t xml:space="preserve">a meaningful </w:t>
+      </w:r>
+      <w:r>
+        <w:rPr>
+          <w:rFonts w:hint="eastAsia"/>
+          <w:color w:val="EE0000"/>
+          <w:lang w:eastAsia="zh-CN"/>
+        </w:rPr>
+        <w:t>reference</w:t>
+      </w:r>
+      <w:r>
+        <w:rPr>
+          <w:rFonts w:hint="eastAsia"/>
+          <w:color w:val="EE0000"/>
+          <w:lang w:eastAsia="zh-CN"/>
+        </w:rPr>
+        <w:t xml:space="preserve"> </w:t>
+      </w:r>
+      <w:r>
+        <w:rPr>
+          <w:rFonts w:hint="eastAsia"/>
+          <w:color w:val="EE0000"/>
+          <w:lang w:eastAsia="zh-CN"/>
+        </w:rPr>
+        <w:t>for</w:t>
+      </w:r>
+      <w:r>
+        <w:rPr>
+          <w:rFonts w:hint="eastAsia"/>
+          <w:color w:val="EE0000"/>
+          <w:lang w:eastAsia="zh-CN"/>
+        </w:rPr>
+        <w:t xml:space="preserve"> our experiments.</w:t>
       </w:r>
     </w:p>
     <w:p>
-      <w:r>
-        <w:t xml:space="preserve"> </w:t>
-      </w:r>
       <w:r>
         <w:t>Figure: Taken from Jin et al. 2019</w:t>
       </w:r>
@@ -337,16 +1003,16 @@
         <mc:AlternateContent>
           <mc:Choice Requires="wps">
             <w:drawing>
-              <wp:anchor distT="0" distB="0" distL="114300" distR="114300" simplePos="0" relativeHeight="251659264" behindDoc="0" locked="0" layoutInCell="1" allowOverlap="1" wp14:anchorId="47728051" wp14:editId="17D13A4F">
+              <wp:anchor distT="0" distB="0" distL="114300" distR="114300" simplePos="0" relativeHeight="251659264" behindDoc="0" locked="0" layoutInCell="1" allowOverlap="1" wp14:anchorId="47728051" wp14:editId="49BDE24E">
                 <wp:simplePos x="0" y="0"/>
                 <wp:positionH relativeFrom="column">
-                  <wp:posOffset>11017</wp:posOffset>
+                  <wp:posOffset>12700</wp:posOffset>
                 </wp:positionH>
                 <wp:positionV relativeFrom="paragraph">
-                  <wp:posOffset>6917</wp:posOffset>
+                  <wp:posOffset>5715</wp:posOffset>
                 </wp:positionV>
-                <wp:extent cx="3536414" cy="3503364"/>
-                <wp:effectExtent l="0" t="0" r="6985" b="14605"/>
+                <wp:extent cx="5619750" cy="2514600"/>
+                <wp:effectExtent l="0" t="0" r="19050" b="19050"/>
                 <wp:wrapNone/>
                 <wp:docPr id="631614199" name="Text Box 1"/>
                 <wp:cNvGraphicFramePr/>
@@ -357,7 +1023,7 @@
                       <wps:spPr>
                         <a:xfrm>
                           <a:off x="0" y="0"/>
-                          <a:ext cx="3536414" cy="3503364"/>
+                          <a:ext cx="5619750" cy="2514600"/>
                         </a:xfrm>
                         <a:prstGeom prst="rect">
                           <a:avLst/>
@@ -470,23 +1136,7 @@
                                 <w:sz w:val="21"/>
                                 <w:szCs w:val="21"/>
                               </w:rPr>
-                              <w:t xml:space="preserve">(Results) The overall incidence of postoperative AF was 26%. Postoperative AF was significantly lower in the Statin group compared with the </w:t>
-                            </w:r>
-                            <w:proofErr w:type="gramStart"/>
-                            <w:r>
-                              <w:rPr>
-                                <w:sz w:val="21"/>
-                                <w:szCs w:val="21"/>
-                              </w:rPr>
-                              <w:t>Non-statin</w:t>
-                            </w:r>
-                            <w:proofErr w:type="gramEnd"/>
-                            <w:r>
-                              <w:rPr>
-                                <w:sz w:val="21"/>
-                                <w:szCs w:val="21"/>
-                              </w:rPr>
-                              <w:t xml:space="preserve"> group (16% versus 33%, p=0.005). Multivariate analysis demonstrated that independent predictors of AF [...] </w:t>
+                              <w:t xml:space="preserve">(Results) The overall incidence of postoperative AF was 26%. Postoperative AF was significantly lower in the Statin group compared with the Non-statin group (16% versus 33%, p=0.005). Multivariate analysis demonstrated that independent predictors of AF [...] </w:t>
                             </w:r>
                           </w:p>
                           <w:p>
@@ -570,7 +1220,7 @@
                 <v:stroke joinstyle="miter"/>
                 <v:path gradientshapeok="t" o:connecttype="rect"/>
               </v:shapetype>
-              <v:shape id="Text Box 1" o:spid="_x0000_s1026" type="#_x0000_t202" style="position:absolute;margin-left:.85pt;margin-top:.55pt;width:278.45pt;height:275.85pt;z-index:251659264;visibility:visible;mso-wrap-style:square;mso-width-percent:0;mso-height-percent:0;mso-wrap-distance-left:9pt;mso-wrap-distance-top:0;mso-wrap-distance-right:9pt;mso-wrap-distance-bottom:0;mso-position-horizontal:absolute;mso-position-horizontal-relative:text;mso-position-vertical:absolute;mso-position-vertical-relative:text;mso-width-percent:0;mso-height-percent:0;mso-width-relative:margin;mso-height-relative:margin;v-text-anchor:top" o:gfxdata="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" fillcolor="white [3201]" strokeweight=".5pt">
+              <v:shape id="Text Box 1" o:spid="_x0000_s1026" type="#_x0000_t202" style="position:absolute;margin-left:1pt;margin-top:.45pt;width:442.5pt;height:198pt;z-index:251659264;visibility:visible;mso-wrap-style:square;mso-width-percent:0;mso-height-percent:0;mso-wrap-distance-left:9pt;mso-wrap-distance-top:0;mso-wrap-distance-right:9pt;mso-wrap-distance-bottom:0;mso-position-horizontal:absolute;mso-position-horizontal-relative:text;mso-position-vertical:absolute;mso-position-vertical-relative:text;mso-width-percent:0;mso-height-percent:0;mso-width-relative:margin;mso-height-relative:margin;v-text-anchor:top" o:gfxdata="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" fillcolor="white [3201]" strokeweight=".5pt">
                 <v:textbox>
                   <w:txbxContent>
                     <w:p>
@@ -758,13 +1408,6 @@
     <w:p/>
     <w:p/>
     <w:p/>
-    <w:p/>
-    <w:p/>
-    <w:p/>
-    <w:p/>
-    <w:p/>
-    <w:p/>
-    <w:p/>
     <w:p>
       <w:pPr>
         <w:rPr>
@@ -783,29 +1426,7 @@
           <w:szCs w:val="20"/>
           <w:shd w:val="clear" w:color="auto" w:fill="FFFFFF"/>
         </w:rPr>
-        <w:t xml:space="preserve">Jin, Q., Dhingra, B., Liu, Z., Cohen, W. and Lu, X., 2019, November. </w:t>
-      </w:r>
-      <w:proofErr w:type="spellStart"/>
-      <w:r>
-        <w:rPr>
-          <w:rFonts w:ascii="Arial" w:hAnsi="Arial" w:cs="Arial"/>
-          <w:color w:val="222222"/>
-          <w:sz w:val="20"/>
-          <w:szCs w:val="20"/>
-          <w:shd w:val="clear" w:color="auto" w:fill="FFFFFF"/>
-        </w:rPr>
-        <w:t>Pubmedqa</w:t>
-      </w:r>
-      <w:proofErr w:type="spellEnd"/>
-      <w:r>
-        <w:rPr>
-          <w:rFonts w:ascii="Arial" w:hAnsi="Arial" w:cs="Arial"/>
-          <w:color w:val="222222"/>
-          <w:sz w:val="20"/>
-          <w:szCs w:val="20"/>
-          <w:shd w:val="clear" w:color="auto" w:fill="FFFFFF"/>
-        </w:rPr>
-        <w:t>: A dataset for biomedical research question answering. In </w:t>
+        <w:t>Jin, Q., Dhingra, B., Liu, Z., Cohen, W. and Lu, X., 2019, November. Pubmedqa: A dataset for biomedical research question answering. In </w:t>
       </w:r>
       <w:r>
         <w:rPr>
@@ -839,29 +1460,7 @@
           <w:szCs w:val="20"/>
           <w:shd w:val="clear" w:color="auto" w:fill="FFFFFF"/>
         </w:rPr>
-        <w:t xml:space="preserve">Sakamoto, H., Watanabe, Y. and Satou, M., 2011. Do preoperative statins reduce atrial fibrillation after coronary artery bypass </w:t>
-      </w:r>
-      <w:proofErr w:type="gramStart"/>
-      <w:r>
-        <w:rPr>
-          <w:rFonts w:ascii="Arial" w:hAnsi="Arial" w:cs="Arial"/>
-          <w:color w:val="222222"/>
-          <w:sz w:val="20"/>
-          <w:szCs w:val="20"/>
-          <w:shd w:val="clear" w:color="auto" w:fill="FFFFFF"/>
-        </w:rPr>
-        <w:t>grafting?.</w:t>
-      </w:r>
-      <w:proofErr w:type="gramEnd"/>
-      <w:r>
-        <w:rPr>
-          <w:rFonts w:ascii="Arial" w:hAnsi="Arial" w:cs="Arial"/>
-          <w:color w:val="222222"/>
-          <w:sz w:val="20"/>
-          <w:szCs w:val="20"/>
-          <w:shd w:val="clear" w:color="auto" w:fill="FFFFFF"/>
-        </w:rPr>
-        <w:t> </w:t>
+        <w:t>Sakamoto, H., Watanabe, Y. and Satou, M., 2011. Do preoperative statins reduce atrial fibrillation after coronary artery bypass grafting?. </w:t>
       </w:r>
       <w:r>
         <w:rPr>
@@ -1043,7 +1642,7 @@
   <w:docDefaults>
     <w:rPrDefault>
       <w:rPr>
-        <w:rFonts w:asciiTheme="minorHAnsi" w:eastAsiaTheme="minorHAnsi" w:hAnsiTheme="minorHAnsi" w:cstheme="minorBidi"/>
+        <w:rFonts w:asciiTheme="minorHAnsi" w:eastAsiaTheme="minorEastAsia" w:hAnsiTheme="minorHAnsi" w:cstheme="minorBidi"/>
         <w:kern w:val="2"/>
         <w:sz w:val="24"/>
         <w:szCs w:val="24"/>
@@ -1435,15 +2034,15 @@
     <w:lsdException w:name="Unresolved Mention" w:semiHidden="1" w:unhideWhenUsed="1"/>
     <w:lsdException w:name="Smart Link" w:semiHidden="1" w:unhideWhenUsed="1"/>
   </w:latentStyles>
-  <w:style w:type="paragraph" w:default="1" w:styleId="Normal">
+  <w:style w:type="paragraph" w:default="1" w:styleId="a">
     <w:name w:val="Normal"/>
     <w:qFormat/>
   </w:style>
-  <w:style w:type="paragraph" w:styleId="Heading1">
+  <w:style w:type="paragraph" w:styleId="1">
     <w:name w:val="heading 1"/>
-    <w:basedOn w:val="Normal"/>
-    <w:next w:val="Normal"/>
-    <w:link w:val="Heading1Char"/>
+    <w:basedOn w:val="a"/>
+    <w:next w:val="a"/>
+    <w:link w:val="10"/>
     <w:uiPriority w:val="9"/>
     <w:qFormat/>
     <w:rsid w:val="00CF34DA"/>
@@ -1460,11 +2059,11 @@
       <w:szCs w:val="40"/>
     </w:rPr>
   </w:style>
-  <w:style w:type="paragraph" w:styleId="Heading2">
+  <w:style w:type="paragraph" w:styleId="2">
     <w:name w:val="heading 2"/>
-    <w:basedOn w:val="Normal"/>
-    <w:next w:val="Normal"/>
-    <w:link w:val="Heading2Char"/>
+    <w:basedOn w:val="a"/>
+    <w:next w:val="a"/>
+    <w:link w:val="20"/>
     <w:uiPriority w:val="9"/>
     <w:semiHidden/>
     <w:unhideWhenUsed/>
@@ -1483,11 +2082,11 @@
       <w:szCs w:val="32"/>
     </w:rPr>
   </w:style>
-  <w:style w:type="paragraph" w:styleId="Heading3">
+  <w:style w:type="paragraph" w:styleId="3">
     <w:name w:val="heading 3"/>
-    <w:basedOn w:val="Normal"/>
-    <w:next w:val="Normal"/>
-    <w:link w:val="Heading3Char"/>
+    <w:basedOn w:val="a"/>
+    <w:next w:val="a"/>
+    <w:link w:val="30"/>
     <w:uiPriority w:val="9"/>
     <w:semiHidden/>
     <w:unhideWhenUsed/>
@@ -1506,11 +2105,11 @@
       <w:szCs w:val="28"/>
     </w:rPr>
   </w:style>
-  <w:style w:type="paragraph" w:styleId="Heading4">
+  <w:style w:type="paragraph" w:styleId="4">
     <w:name w:val="heading 4"/>
-    <w:basedOn w:val="Normal"/>
-    <w:next w:val="Normal"/>
-    <w:link w:val="Heading4Char"/>
+    <w:basedOn w:val="a"/>
+    <w:next w:val="a"/>
+    <w:link w:val="40"/>
     <w:uiPriority w:val="9"/>
     <w:semiHidden/>
     <w:unhideWhenUsed/>
@@ -1529,11 +2128,11 @@
       <w:color w:val="0F4761" w:themeColor="accent1" w:themeShade="BF"/>
     </w:rPr>
   </w:style>
-  <w:style w:type="paragraph" w:styleId="Heading5">
+  <w:style w:type="paragraph" w:styleId="5">
     <w:name w:val="heading 5"/>
-    <w:basedOn w:val="Normal"/>
-    <w:next w:val="Normal"/>
-    <w:link w:val="Heading5Char"/>
+    <w:basedOn w:val="a"/>
+    <w:next w:val="a"/>
+    <w:link w:val="50"/>
     <w:uiPriority w:val="9"/>
     <w:semiHidden/>
     <w:unhideWhenUsed/>
@@ -1550,11 +2149,11 @@
       <w:color w:val="0F4761" w:themeColor="accent1" w:themeShade="BF"/>
     </w:rPr>
   </w:style>
-  <w:style w:type="paragraph" w:styleId="Heading6">
+  <w:style w:type="paragraph" w:styleId="6">
     <w:name w:val="heading 6"/>
-    <w:basedOn w:val="Normal"/>
-    <w:next w:val="Normal"/>
-    <w:link w:val="Heading6Char"/>
+    <w:basedOn w:val="a"/>
+    <w:next w:val="a"/>
+    <w:link w:val="60"/>
     <w:uiPriority w:val="9"/>
     <w:semiHidden/>
     <w:unhideWhenUsed/>
@@ -1573,11 +2172,11 @@
       <w:color w:val="595959" w:themeColor="text1" w:themeTint="A6"/>
     </w:rPr>
   </w:style>
-  <w:style w:type="paragraph" w:styleId="Heading7">
+  <w:style w:type="paragraph" w:styleId="7">
     <w:name w:val="heading 7"/>
-    <w:basedOn w:val="Normal"/>
-    <w:next w:val="Normal"/>
-    <w:link w:val="Heading7Char"/>
+    <w:basedOn w:val="a"/>
+    <w:next w:val="a"/>
+    <w:link w:val="70"/>
     <w:uiPriority w:val="9"/>
     <w:semiHidden/>
     <w:unhideWhenUsed/>
@@ -1594,11 +2193,11 @@
       <w:color w:val="595959" w:themeColor="text1" w:themeTint="A6"/>
     </w:rPr>
   </w:style>
-  <w:style w:type="paragraph" w:styleId="Heading8">
+  <w:style w:type="paragraph" w:styleId="8">
     <w:name w:val="heading 8"/>
-    <w:basedOn w:val="Normal"/>
-    <w:next w:val="Normal"/>
-    <w:link w:val="Heading8Char"/>
+    <w:basedOn w:val="a"/>
+    <w:next w:val="a"/>
+    <w:link w:val="80"/>
     <w:uiPriority w:val="9"/>
     <w:semiHidden/>
     <w:unhideWhenUsed/>
@@ -1617,11 +2216,11 @@
       <w:color w:val="272727" w:themeColor="text1" w:themeTint="D8"/>
     </w:rPr>
   </w:style>
-  <w:style w:type="paragraph" w:styleId="Heading9">
+  <w:style w:type="paragraph" w:styleId="9">
     <w:name w:val="heading 9"/>
-    <w:basedOn w:val="Normal"/>
-    <w:next w:val="Normal"/>
-    <w:link w:val="Heading9Char"/>
+    <w:basedOn w:val="a"/>
+    <w:next w:val="a"/>
+    <w:link w:val="90"/>
     <w:uiPriority w:val="9"/>
     <w:semiHidden/>
     <w:unhideWhenUsed/>
@@ -1638,13 +2237,13 @@
       <w:color w:val="272727" w:themeColor="text1" w:themeTint="D8"/>
     </w:rPr>
   </w:style>
-  <w:style w:type="character" w:default="1" w:styleId="DefaultParagraphFont">
+  <w:style w:type="character" w:default="1" w:styleId="a0">
     <w:name w:val="Default Paragraph Font"/>
     <w:uiPriority w:val="1"/>
     <w:semiHidden/>
     <w:unhideWhenUsed/>
   </w:style>
-  <w:style w:type="table" w:default="1" w:styleId="TableNormal">
+  <w:style w:type="table" w:default="1" w:styleId="a1">
     <w:name w:val="Normal Table"/>
     <w:uiPriority w:val="99"/>
     <w:semiHidden/>
@@ -1659,16 +2258,16 @@
       </w:tblCellMar>
     </w:tblPr>
   </w:style>
-  <w:style w:type="numbering" w:default="1" w:styleId="NoList">
+  <w:style w:type="numbering" w:default="1" w:styleId="a2">
     <w:name w:val="No List"/>
     <w:uiPriority w:val="99"/>
     <w:semiHidden/>
     <w:unhideWhenUsed/>
   </w:style>
-  <w:style w:type="character" w:customStyle="1" w:styleId="Heading1Char">
-    <w:name w:val="Heading 1 Char"/>
-    <w:basedOn w:val="DefaultParagraphFont"/>
-    <w:link w:val="Heading1"/>
+  <w:style w:type="character" w:customStyle="1" w:styleId="10">
+    <w:name w:val="标题 1 字符"/>
+    <w:basedOn w:val="a0"/>
+    <w:link w:val="1"/>
     <w:uiPriority w:val="9"/>
     <w:rsid w:val="00CF34DA"/>
     <w:rPr>
@@ -1678,10 +2277,10 @@
       <w:szCs w:val="40"/>
     </w:rPr>
   </w:style>
-  <w:style w:type="character" w:customStyle="1" w:styleId="Heading2Char">
-    <w:name w:val="Heading 2 Char"/>
-    <w:basedOn w:val="DefaultParagraphFont"/>
-    <w:link w:val="Heading2"/>
+  <w:style w:type="character" w:customStyle="1" w:styleId="20">
+    <w:name w:val="标题 2 字符"/>
+    <w:basedOn w:val="a0"/>
+    <w:link w:val="2"/>
     <w:uiPriority w:val="9"/>
     <w:semiHidden/>
     <w:rsid w:val="00CF34DA"/>
@@ -1692,10 +2291,10 @@
       <w:szCs w:val="32"/>
     </w:rPr>
   </w:style>
-  <w:style w:type="character" w:customStyle="1" w:styleId="Heading3Char">
-    <w:name w:val="Heading 3 Char"/>
-    <w:basedOn w:val="DefaultParagraphFont"/>
-    <w:link w:val="Heading3"/>
+  <w:style w:type="character" w:customStyle="1" w:styleId="30">
+    <w:name w:val="标题 3 字符"/>
+    <w:basedOn w:val="a0"/>
+    <w:link w:val="3"/>
     <w:uiPriority w:val="9"/>
     <w:semiHidden/>
     <w:rsid w:val="00CF34DA"/>
@@ -1706,10 +2305,10 @@
       <w:szCs w:val="28"/>
     </w:rPr>
   </w:style>
-  <w:style w:type="character" w:customStyle="1" w:styleId="Heading4Char">
-    <w:name w:val="Heading 4 Char"/>
-    <w:basedOn w:val="DefaultParagraphFont"/>
-    <w:link w:val="Heading4"/>
+  <w:style w:type="character" w:customStyle="1" w:styleId="40">
+    <w:name w:val="标题 4 字符"/>
+    <w:basedOn w:val="a0"/>
+    <w:link w:val="4"/>
     <w:uiPriority w:val="9"/>
     <w:semiHidden/>
     <w:rsid w:val="00CF34DA"/>
@@ -1720,10 +2319,10 @@
       <w:color w:val="0F4761" w:themeColor="accent1" w:themeShade="BF"/>
     </w:rPr>
   </w:style>
-  <w:style w:type="character" w:customStyle="1" w:styleId="Heading5Char">
-    <w:name w:val="Heading 5 Char"/>
-    <w:basedOn w:val="DefaultParagraphFont"/>
-    <w:link w:val="Heading5"/>
+  <w:style w:type="character" w:customStyle="1" w:styleId="50">
+    <w:name w:val="标题 5 字符"/>
+    <w:basedOn w:val="a0"/>
+    <w:link w:val="5"/>
     <w:uiPriority w:val="9"/>
     <w:semiHidden/>
     <w:rsid w:val="00CF34DA"/>
@@ -1732,10 +2331,10 @@
       <w:color w:val="0F4761" w:themeColor="accent1" w:themeShade="BF"/>
     </w:rPr>
   </w:style>
-  <w:style w:type="character" w:customStyle="1" w:styleId="Heading6Char">
-    <w:name w:val="Heading 6 Char"/>
-    <w:basedOn w:val="DefaultParagraphFont"/>
-    <w:link w:val="Heading6"/>
+  <w:style w:type="character" w:customStyle="1" w:styleId="60">
+    <w:name w:val="标题 6 字符"/>
+    <w:basedOn w:val="a0"/>
+    <w:link w:val="6"/>
     <w:uiPriority w:val="9"/>
     <w:semiHidden/>
     <w:rsid w:val="00CF34DA"/>
@@ -1746,10 +2345,10 @@
       <w:color w:val="595959" w:themeColor="text1" w:themeTint="A6"/>
     </w:rPr>
   </w:style>
-  <w:style w:type="character" w:customStyle="1" w:styleId="Heading7Char">
-    <w:name w:val="Heading 7 Char"/>
-    <w:basedOn w:val="DefaultParagraphFont"/>
-    <w:link w:val="Heading7"/>
+  <w:style w:type="character" w:customStyle="1" w:styleId="70">
+    <w:name w:val="标题 7 字符"/>
+    <w:basedOn w:val="a0"/>
+    <w:link w:val="7"/>
     <w:uiPriority w:val="9"/>
     <w:semiHidden/>
     <w:rsid w:val="00CF34DA"/>
@@ -1758,10 +2357,10 @@
       <w:color w:val="595959" w:themeColor="text1" w:themeTint="A6"/>
     </w:rPr>
   </w:style>
-  <w:style w:type="character" w:customStyle="1" w:styleId="Heading8Char">
-    <w:name w:val="Heading 8 Char"/>
-    <w:basedOn w:val="DefaultParagraphFont"/>
-    <w:link w:val="Heading8"/>
+  <w:style w:type="character" w:customStyle="1" w:styleId="80">
+    <w:name w:val="标题 8 字符"/>
+    <w:basedOn w:val="a0"/>
+    <w:link w:val="8"/>
     <w:uiPriority w:val="9"/>
     <w:semiHidden/>
     <w:rsid w:val="00CF34DA"/>
@@ -1772,10 +2371,10 @@
       <w:color w:val="272727" w:themeColor="text1" w:themeTint="D8"/>
     </w:rPr>
   </w:style>
-  <w:style w:type="character" w:customStyle="1" w:styleId="Heading9Char">
-    <w:name w:val="Heading 9 Char"/>
-    <w:basedOn w:val="DefaultParagraphFont"/>
-    <w:link w:val="Heading9"/>
+  <w:style w:type="character" w:customStyle="1" w:styleId="90">
+    <w:name w:val="标题 9 字符"/>
+    <w:basedOn w:val="a0"/>
+    <w:link w:val="9"/>
     <w:uiPriority w:val="9"/>
     <w:semiHidden/>
     <w:rsid w:val="00CF34DA"/>
@@ -1784,11 +2383,11 @@
       <w:color w:val="272727" w:themeColor="text1" w:themeTint="D8"/>
     </w:rPr>
   </w:style>
-  <w:style w:type="paragraph" w:styleId="Title">
+  <w:style w:type="paragraph" w:styleId="a3">
     <w:name w:val="Title"/>
-    <w:basedOn w:val="Normal"/>
-    <w:next w:val="Normal"/>
-    <w:link w:val="TitleChar"/>
+    <w:basedOn w:val="a"/>
+    <w:next w:val="a"/>
+    <w:link w:val="a4"/>
     <w:uiPriority w:val="10"/>
     <w:qFormat/>
     <w:rsid w:val="00CF34DA"/>
@@ -1804,10 +2403,10 @@
       <w:szCs w:val="56"/>
     </w:rPr>
   </w:style>
-  <w:style w:type="character" w:customStyle="1" w:styleId="TitleChar">
-    <w:name w:val="Title Char"/>
-    <w:basedOn w:val="DefaultParagraphFont"/>
-    <w:link w:val="Title"/>
+  <w:style w:type="character" w:customStyle="1" w:styleId="a4">
+    <w:name w:val="标题 字符"/>
+    <w:basedOn w:val="a0"/>
+    <w:link w:val="a3"/>
     <w:uiPriority w:val="10"/>
     <w:rsid w:val="00CF34DA"/>
     <w:rPr>
@@ -1818,11 +2417,11 @@
       <w:szCs w:val="56"/>
     </w:rPr>
   </w:style>
-  <w:style w:type="paragraph" w:styleId="Subtitle">
+  <w:style w:type="paragraph" w:styleId="a5">
     <w:name w:val="Subtitle"/>
-    <w:basedOn w:val="Normal"/>
-    <w:next w:val="Normal"/>
-    <w:link w:val="SubtitleChar"/>
+    <w:basedOn w:val="a"/>
+    <w:next w:val="a"/>
+    <w:link w:val="a6"/>
     <w:uiPriority w:val="11"/>
     <w:qFormat/>
     <w:rsid w:val="00CF34DA"/>
@@ -1839,10 +2438,10 @@
       <w:szCs w:val="28"/>
     </w:rPr>
   </w:style>
-  <w:style w:type="character" w:customStyle="1" w:styleId="SubtitleChar">
-    <w:name w:val="Subtitle Char"/>
-    <w:basedOn w:val="DefaultParagraphFont"/>
-    <w:link w:val="Subtitle"/>
+  <w:style w:type="character" w:customStyle="1" w:styleId="a6">
+    <w:name w:val="副标题 字符"/>
+    <w:basedOn w:val="a0"/>
+    <w:link w:val="a5"/>
     <w:uiPriority w:val="11"/>
     <w:rsid w:val="00CF34DA"/>
     <w:rPr>
@@ -1853,11 +2452,11 @@
       <w:szCs w:val="28"/>
     </w:rPr>
   </w:style>
-  <w:style w:type="paragraph" w:styleId="Quote">
+  <w:style w:type="paragraph" w:styleId="a7">
     <w:name w:val="Quote"/>
-    <w:basedOn w:val="Normal"/>
-    <w:next w:val="Normal"/>
-    <w:link w:val="QuoteChar"/>
+    <w:basedOn w:val="a"/>
+    <w:next w:val="a"/>
+    <w:link w:val="a8"/>
     <w:uiPriority w:val="29"/>
     <w:qFormat/>
     <w:rsid w:val="00CF34DA"/>
@@ -1871,10 +2470,10 @@
       <w:color w:val="404040" w:themeColor="text1" w:themeTint="BF"/>
     </w:rPr>
   </w:style>
-  <w:style w:type="character" w:customStyle="1" w:styleId="QuoteChar">
-    <w:name w:val="Quote Char"/>
-    <w:basedOn w:val="DefaultParagraphFont"/>
-    <w:link w:val="Quote"/>
+  <w:style w:type="character" w:customStyle="1" w:styleId="a8">
+    <w:name w:val="引用 字符"/>
+    <w:basedOn w:val="a0"/>
+    <w:link w:val="a7"/>
     <w:uiPriority w:val="29"/>
     <w:rsid w:val="00CF34DA"/>
     <w:rPr>
@@ -1883,9 +2482,9 @@
       <w:color w:val="404040" w:themeColor="text1" w:themeTint="BF"/>
     </w:rPr>
   </w:style>
-  <w:style w:type="paragraph" w:styleId="ListParagraph">
+  <w:style w:type="paragraph" w:styleId="a9">
     <w:name w:val="List Paragraph"/>
-    <w:basedOn w:val="Normal"/>
+    <w:basedOn w:val="a"/>
     <w:uiPriority w:val="34"/>
     <w:qFormat/>
     <w:rsid w:val="00CF34DA"/>
@@ -1894,9 +2493,9 @@
       <w:contextualSpacing/>
     </w:pPr>
   </w:style>
-  <w:style w:type="character" w:styleId="IntenseEmphasis">
+  <w:style w:type="character" w:styleId="aa">
     <w:name w:val="Intense Emphasis"/>
-    <w:basedOn w:val="DefaultParagraphFont"/>
+    <w:basedOn w:val="a0"/>
     <w:uiPriority w:val="21"/>
     <w:qFormat/>
     <w:rsid w:val="00CF34DA"/>
@@ -1906,11 +2505,11 @@
       <w:color w:val="0F4761" w:themeColor="accent1" w:themeShade="BF"/>
     </w:rPr>
   </w:style>
-  <w:style w:type="paragraph" w:styleId="IntenseQuote">
+  <w:style w:type="paragraph" w:styleId="ab">
     <w:name w:val="Intense Quote"/>
-    <w:basedOn w:val="Normal"/>
-    <w:next w:val="Normal"/>
-    <w:link w:val="IntenseQuoteChar"/>
+    <w:basedOn w:val="a"/>
+    <w:next w:val="a"/>
+    <w:link w:val="ac"/>
     <w:uiPriority w:val="30"/>
     <w:qFormat/>
     <w:rsid w:val="00CF34DA"/>
@@ -1929,10 +2528,10 @@
       <w:color w:val="0F4761" w:themeColor="accent1" w:themeShade="BF"/>
     </w:rPr>
   </w:style>
-  <w:style w:type="character" w:customStyle="1" w:styleId="IntenseQuoteChar">
-    <w:name w:val="Intense Quote Char"/>
-    <w:basedOn w:val="DefaultParagraphFont"/>
-    <w:link w:val="IntenseQuote"/>
+  <w:style w:type="character" w:customStyle="1" w:styleId="ac">
+    <w:name w:val="明显引用 字符"/>
+    <w:basedOn w:val="a0"/>
+    <w:link w:val="ab"/>
     <w:uiPriority w:val="30"/>
     <w:rsid w:val="00CF34DA"/>
     <w:rPr>
@@ -1941,9 +2540,9 @@
       <w:color w:val="0F4761" w:themeColor="accent1" w:themeShade="BF"/>
     </w:rPr>
   </w:style>
-  <w:style w:type="character" w:styleId="IntenseReference">
+  <w:style w:type="character" w:styleId="ad">
     <w:name w:val="Intense Reference"/>
-    <w:basedOn w:val="DefaultParagraphFont"/>
+    <w:basedOn w:val="a0"/>
     <w:uiPriority w:val="32"/>
     <w:qFormat/>
     <w:rsid w:val="00CF34DA"/>

</xml_diff>

<commit_message>
add introduction markdown file
</commit_message>
<xml_diff>
--- a/Report/Introduction.docx
+++ b/Report/Introduction.docx
@@ -120,7 +120,15 @@
         <w:t>aim to design</w:t>
       </w:r>
       <w:r>
-        <w:t xml:space="preserve"> and implement a QAS capable of answering biomedical questions using the PubMedQA dataset. </w:t>
+        <w:t xml:space="preserve"> and implement a QAS capable of answering biomedical questions using the </w:t>
+      </w:r>
+      <w:proofErr w:type="spellStart"/>
+      <w:r>
+        <w:t>PubMedQA</w:t>
+      </w:r>
+      <w:proofErr w:type="spellEnd"/>
+      <w:r>
+        <w:t xml:space="preserve"> dataset. </w:t>
       </w:r>
       <w:r>
         <w:t xml:space="preserve">Our primary objective is to investigate how different text representations and model architectures affect the quality of answers. By systematically comparing alternative approaches, we aim to identify which methods are most effective for handling the challenges of biomedical question answering. </w:t>
@@ -128,7 +136,15 @@
     </w:p>
     <w:p>
       <w:r>
-        <w:t xml:space="preserve">In order to evaluate variations of our system we use PubMedQA; a dataset constructed from biomedical research papers. </w:t>
+        <w:t xml:space="preserve">In order to evaluate variations of our system we use </w:t>
+      </w:r>
+      <w:proofErr w:type="spellStart"/>
+      <w:r>
+        <w:t>PubMedQA</w:t>
+      </w:r>
+      <w:proofErr w:type="spellEnd"/>
+      <w:r>
+        <w:t xml:space="preserve">; a dataset constructed from biomedical research papers. </w:t>
       </w:r>
       <w:r>
         <w:t>Each instance in t</w:t>
@@ -992,7 +1008,15 @@
         <w:t>Figure: Taken from Jin et al. 2019</w:t>
       </w:r>
       <w:r>
-        <w:t xml:space="preserve">. An instance (Sakamoto et al. 2011) from PubMedQA dataset. </w:t>
+        <w:t xml:space="preserve">. An instance (Sakamoto et al. 2011) from </w:t>
+      </w:r>
+      <w:proofErr w:type="spellStart"/>
+      <w:r>
+        <w:t>PubMedQA</w:t>
+      </w:r>
+      <w:proofErr w:type="spellEnd"/>
+      <w:r>
+        <w:t xml:space="preserve"> dataset. </w:t>
       </w:r>
     </w:p>
     <w:p>
@@ -1003,16 +1027,16 @@
         <mc:AlternateContent>
           <mc:Choice Requires="wps">
             <w:drawing>
-              <wp:anchor distT="0" distB="0" distL="114300" distR="114300" simplePos="0" relativeHeight="251659264" behindDoc="0" locked="0" layoutInCell="1" allowOverlap="1" wp14:anchorId="47728051" wp14:editId="49BDE24E">
+              <wp:anchor distT="0" distB="0" distL="114300" distR="114300" simplePos="0" relativeHeight="251659264" behindDoc="0" locked="0" layoutInCell="1" allowOverlap="1" wp14:anchorId="47728051" wp14:editId="6930BACE">
                 <wp:simplePos x="0" y="0"/>
-                <wp:positionH relativeFrom="column">
-                  <wp:posOffset>12700</wp:posOffset>
+                <wp:positionH relativeFrom="margin">
+                  <wp:align>left</wp:align>
                 </wp:positionH>
                 <wp:positionV relativeFrom="paragraph">
                   <wp:posOffset>5715</wp:posOffset>
                 </wp:positionV>
-                <wp:extent cx="5619750" cy="2514600"/>
-                <wp:effectExtent l="0" t="0" r="19050" b="19050"/>
+                <wp:extent cx="5619750" cy="2574063"/>
+                <wp:effectExtent l="0" t="0" r="19050" b="17145"/>
                 <wp:wrapNone/>
                 <wp:docPr id="631614199" name="Text Box 1"/>
                 <wp:cNvGraphicFramePr/>
@@ -1023,7 +1047,7 @@
                       <wps:spPr>
                         <a:xfrm>
                           <a:off x="0" y="0"/>
-                          <a:ext cx="5619750" cy="2514600"/>
+                          <a:ext cx="5619750" cy="2574063"/>
                         </a:xfrm>
                         <a:prstGeom prst="rect">
                           <a:avLst/>
@@ -1136,7 +1160,23 @@
                                 <w:sz w:val="21"/>
                                 <w:szCs w:val="21"/>
                               </w:rPr>
-                              <w:t xml:space="preserve">(Results) The overall incidence of postoperative AF was 26%. Postoperative AF was significantly lower in the Statin group compared with the Non-statin group (16% versus 33%, p=0.005). Multivariate analysis demonstrated that independent predictors of AF [...] </w:t>
+                              <w:t xml:space="preserve">(Results) The overall incidence of postoperative AF was 26%. Postoperative AF was significantly lower in the Statin group compared with the </w:t>
+                            </w:r>
+                            <w:proofErr w:type="gramStart"/>
+                            <w:r>
+                              <w:rPr>
+                                <w:sz w:val="21"/>
+                                <w:szCs w:val="21"/>
+                              </w:rPr>
+                              <w:t>Non-statin</w:t>
+                            </w:r>
+                            <w:proofErr w:type="gramEnd"/>
+                            <w:r>
+                              <w:rPr>
+                                <w:sz w:val="21"/>
+                                <w:szCs w:val="21"/>
+                              </w:rPr>
+                              <w:t xml:space="preserve"> group (16% versus 33%, p=0.005). Multivariate analysis demonstrated that independent predictors of AF [...] </w:t>
                             </w:r>
                           </w:p>
                           <w:p>
@@ -1220,7 +1260,7 @@
                 <v:stroke joinstyle="miter"/>
                 <v:path gradientshapeok="t" o:connecttype="rect"/>
               </v:shapetype>
-              <v:shape id="Text Box 1" o:spid="_x0000_s1026" type="#_x0000_t202" style="position:absolute;margin-left:1pt;margin-top:.45pt;width:442.5pt;height:198pt;z-index:251659264;visibility:visible;mso-wrap-style:square;mso-width-percent:0;mso-height-percent:0;mso-wrap-distance-left:9pt;mso-wrap-distance-top:0;mso-wrap-distance-right:9pt;mso-wrap-distance-bottom:0;mso-position-horizontal:absolute;mso-position-horizontal-relative:text;mso-position-vertical:absolute;mso-position-vertical-relative:text;mso-width-percent:0;mso-height-percent:0;mso-width-relative:margin;mso-height-relative:margin;v-text-anchor:top" o:gfxdata="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" fillcolor="white [3201]" strokeweight=".5pt">
+              <v:shape id="Text Box 1" o:spid="_x0000_s1026" type="#_x0000_t202" style="position:absolute;margin-left:0;margin-top:.45pt;width:442.5pt;height:202.7pt;z-index:251659264;visibility:visible;mso-wrap-style:square;mso-width-percent:0;mso-height-percent:0;mso-wrap-distance-left:9pt;mso-wrap-distance-top:0;mso-wrap-distance-right:9pt;mso-wrap-distance-bottom:0;mso-position-horizontal:left;mso-position-horizontal-relative:margin;mso-position-vertical:absolute;mso-position-vertical-relative:text;mso-width-percent:0;mso-height-percent:0;mso-width-relative:margin;mso-height-relative:margin;v-text-anchor:top" o:gfxdata="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" fillcolor="white [3201]" strokeweight=".5pt">
                 <v:textbox>
                   <w:txbxContent>
                     <w:p>
@@ -1396,6 +1436,7 @@
                     </w:p>
                   </w:txbxContent>
                 </v:textbox>
+                <w10:wrap anchorx="margin"/>
               </v:shape>
             </w:pict>
           </mc:Fallback>
@@ -1418,7 +1459,9 @@
           <w:shd w:val="clear" w:color="auto" w:fill="FFFFFF"/>
         </w:rPr>
       </w:pPr>
-      <w:r>
+    </w:p>
+    <w:p>
+      <w:pPr>
         <w:rPr>
           <w:rFonts w:ascii="Arial" w:hAnsi="Arial" w:cs="Arial"/>
           <w:color w:val="222222"/>
@@ -1426,7 +1469,94 @@
           <w:szCs w:val="20"/>
           <w:shd w:val="clear" w:color="auto" w:fill="FFFFFF"/>
         </w:rPr>
-        <w:t>Jin, Q., Dhingra, B., Liu, Z., Cohen, W. and Lu, X., 2019, November. Pubmedqa: A dataset for biomedical research question answering. In </w:t>
+      </w:pPr>
+    </w:p>
+    <w:p>
+      <w:pPr>
+        <w:rPr>
+          <w:rFonts w:ascii="Arial" w:hAnsi="Arial" w:cs="Arial"/>
+          <w:color w:val="222222"/>
+          <w:sz w:val="20"/>
+          <w:szCs w:val="20"/>
+          <w:shd w:val="clear" w:color="auto" w:fill="FFFFFF"/>
+        </w:rPr>
+      </w:pPr>
+    </w:p>
+    <w:p>
+      <w:pPr>
+        <w:rPr>
+          <w:rFonts w:ascii="Arial" w:hAnsi="Arial" w:cs="Arial"/>
+          <w:color w:val="222222"/>
+          <w:sz w:val="20"/>
+          <w:szCs w:val="20"/>
+          <w:shd w:val="clear" w:color="auto" w:fill="FFFFFF"/>
+        </w:rPr>
+      </w:pPr>
+    </w:p>
+    <w:p>
+      <w:pPr>
+        <w:rPr>
+          <w:rFonts w:ascii="Arial" w:hAnsi="Arial" w:cs="Arial"/>
+          <w:color w:val="222222"/>
+          <w:sz w:val="20"/>
+          <w:szCs w:val="20"/>
+          <w:shd w:val="clear" w:color="auto" w:fill="FFFFFF"/>
+        </w:rPr>
+      </w:pPr>
+    </w:p>
+    <w:p>
+      <w:pPr>
+        <w:rPr>
+          <w:rFonts w:ascii="Arial" w:hAnsi="Arial" w:cs="Arial"/>
+          <w:color w:val="222222"/>
+          <w:sz w:val="20"/>
+          <w:szCs w:val="20"/>
+          <w:shd w:val="clear" w:color="auto" w:fill="FFFFFF"/>
+        </w:rPr>
+      </w:pPr>
+    </w:p>
+    <w:p>
+      <w:pPr>
+        <w:rPr>
+          <w:rFonts w:ascii="Arial" w:hAnsi="Arial" w:cs="Arial"/>
+          <w:color w:val="222222"/>
+          <w:sz w:val="20"/>
+          <w:szCs w:val="20"/>
+          <w:shd w:val="clear" w:color="auto" w:fill="FFFFFF"/>
+        </w:rPr>
+      </w:pPr>
+      <w:r>
+        <w:rPr>
+          <w:rFonts w:ascii="Arial" w:hAnsi="Arial" w:cs="Arial"/>
+          <w:color w:val="222222"/>
+          <w:sz w:val="20"/>
+          <w:szCs w:val="20"/>
+          <w:shd w:val="clear" w:color="auto" w:fill="FFFFFF"/>
+        </w:rPr>
+        <w:lastRenderedPageBreak/>
+        <w:t xml:space="preserve">Jin, Q., Dhingra, B., Liu, Z., Cohen, W. and Lu, X., 2019, November. </w:t>
+      </w:r>
+      <w:proofErr w:type="spellStart"/>
+      <w:r>
+        <w:rPr>
+          <w:rFonts w:ascii="Arial" w:hAnsi="Arial" w:cs="Arial"/>
+          <w:color w:val="222222"/>
+          <w:sz w:val="20"/>
+          <w:szCs w:val="20"/>
+          <w:shd w:val="clear" w:color="auto" w:fill="FFFFFF"/>
+        </w:rPr>
+        <w:t>Pubmedqa</w:t>
+      </w:r>
+      <w:proofErr w:type="spellEnd"/>
+      <w:r>
+        <w:rPr>
+          <w:rFonts w:ascii="Arial" w:hAnsi="Arial" w:cs="Arial"/>
+          <w:color w:val="222222"/>
+          <w:sz w:val="20"/>
+          <w:szCs w:val="20"/>
+          <w:shd w:val="clear" w:color="auto" w:fill="FFFFFF"/>
+        </w:rPr>
+        <w:t>: A dataset for biomedical research question answering. In </w:t>
       </w:r>
       <w:r>
         <w:rPr>
@@ -1460,7 +1590,29 @@
           <w:szCs w:val="20"/>
           <w:shd w:val="clear" w:color="auto" w:fill="FFFFFF"/>
         </w:rPr>
-        <w:t>Sakamoto, H., Watanabe, Y. and Satou, M., 2011. Do preoperative statins reduce atrial fibrillation after coronary artery bypass grafting?. </w:t>
+        <w:t xml:space="preserve">Sakamoto, H., Watanabe, Y. and Satou, M., 2011. Do preoperative statins reduce atrial fibrillation after coronary artery bypass </w:t>
+      </w:r>
+      <w:proofErr w:type="gramStart"/>
+      <w:r>
+        <w:rPr>
+          <w:rFonts w:ascii="Arial" w:hAnsi="Arial" w:cs="Arial"/>
+          <w:color w:val="222222"/>
+          <w:sz w:val="20"/>
+          <w:szCs w:val="20"/>
+          <w:shd w:val="clear" w:color="auto" w:fill="FFFFFF"/>
+        </w:rPr>
+        <w:t>grafting?.</w:t>
+      </w:r>
+      <w:proofErr w:type="gramEnd"/>
+      <w:r>
+        <w:rPr>
+          <w:rFonts w:ascii="Arial" w:hAnsi="Arial" w:cs="Arial"/>
+          <w:color w:val="222222"/>
+          <w:sz w:val="20"/>
+          <w:szCs w:val="20"/>
+          <w:shd w:val="clear" w:color="auto" w:fill="FFFFFF"/>
+        </w:rPr>
+        <w:t> </w:t>
       </w:r>
       <w:r>
         <w:rPr>

</xml_diff>